<commit_message>
ancho y altura imagenes funcional
</commit_message>
<xml_diff>
--- a/Outputs/2. MEMORIA FOTOGRAFICA SAN SEBASTIAN E.S. 7335 VALERO.docx
+++ b/Outputs/2. MEMORIA FOTOGRAFICA SAN SEBASTIAN E.S. 7335 VALERO.docx
@@ -2430,7 +2430,7 @@
           <w:r>
             <w:drawing>
               <wp:inline xmlns:wp="http://schemas.openxmlformats.org/drawingml/2006/wordprocessingDrawing" xmlns:a="http://schemas.openxmlformats.org/drawingml/2006/main" xmlns:pic="http://schemas.openxmlformats.org/drawingml/2006/picture" xmlns:r="http://schemas.openxmlformats.org/officeDocument/2006/relationships">
-                <wp:extent cx="631151" cy="540000"/>
+                <wp:extent cx="540000" cy="462013"/>
                 <wp:docPr id="1" name="Picture 1"/>
                 <wp:cNvGraphicFramePr>
                   <a:graphicFrameLocks noChangeAspect="1"/>
@@ -2451,7 +2451,7 @@
                       <pic:spPr>
                         <a:xfrm>
                           <a:off x="0" y="0"/>
-                          <a:ext cx="631151" cy="540000"/>
+                          <a:ext cx="540000" cy="462013"/>
                         </a:xfrm>
                         <a:prstGeom prst="rect"/>
                       </pic:spPr>

</xml_diff>